<commit_message>
Interfaz de Batalla / Nivel 1Aleatorio y 2Heuristico basico 01
</commit_message>
<xml_diff>
--- a/Documentaciòn del proyecto.docx
+++ b/Documentaciòn del proyecto.docx
@@ -42,18 +42,28 @@
           <w:highlight w:val="yellow"/>
         </w:rPr>
       </w:pPr>
+      <w:proofErr w:type="spellStart"/>
       <w:r>
         <w:rPr>
           <w:b/>
           <w:bCs/>
           <w:highlight w:val="yellow"/>
         </w:rPr>
-        <w:t>Scraping y Estructuración de Datos:</w:t>
-      </w:r>
-      <w:r>
-        <w:rPr>
+        <w:t>Scraping</w:t>
+      </w:r>
+      <w:proofErr w:type="spellEnd"/>
+      <w:r>
+        <w:rPr>
+          <w:b/>
+          <w:bCs/>
           <w:highlight w:val="yellow"/>
         </w:rPr>
+        <w:t xml:space="preserve"> y Estructuración de Datos:</w:t>
+      </w:r>
+      <w:r>
+        <w:rPr>
+          <w:highlight w:val="yellow"/>
+        </w:rPr>
         <w:t xml:space="preserve"> </w:t>
       </w:r>
     </w:p>
@@ -68,13 +78,7 @@
         <w:rPr>
           <w:highlight w:val="yellow"/>
         </w:rPr>
-        <w:t>Imágenes descargadas y JSON listo</w:t>
-      </w:r>
-      <w:r>
-        <w:rPr>
-          <w:highlight w:val="yellow"/>
-        </w:rPr>
-        <w:t>.</w:t>
+        <w:t>Imágenes descargadas y JSON listo.</w:t>
       </w:r>
     </w:p>
     <w:p>
@@ -117,14 +121,22 @@
         <w:rPr>
           <w:highlight w:val="yellow"/>
         </w:rPr>
-        <w:t xml:space="preserve"> con sus sta</w:t>
-      </w:r>
+        <w:t xml:space="preserve"> con sus </w:t>
+      </w:r>
+      <w:proofErr w:type="spellStart"/>
       <w:r>
         <w:rPr>
           <w:highlight w:val="yellow"/>
         </w:rPr>
+        <w:t>sta</w:t>
+      </w:r>
+      <w:r>
+        <w:rPr>
+          <w:highlight w:val="yellow"/>
+        </w:rPr>
         <w:t>ts</w:t>
       </w:r>
+      <w:proofErr w:type="spellEnd"/>
       <w:r>
         <w:rPr>
           <w:highlight w:val="yellow"/>
@@ -174,7 +186,15 @@
         <w:t>Clases en Python:</w:t>
       </w:r>
       <w:r>
-        <w:t xml:space="preserve"> Crear las clases Pokemon, Movimiento y Combate.</w:t>
+        <w:t xml:space="preserve"> Crear las clases </w:t>
+      </w:r>
+      <w:proofErr w:type="spellStart"/>
+      <w:r>
+        <w:t>Pokemon</w:t>
+      </w:r>
+      <w:proofErr w:type="spellEnd"/>
+      <w:r>
+        <w:t>, Movimiento y Combate.</w:t>
       </w:r>
     </w:p>
     <w:p>
@@ -192,7 +212,47 @@
         <w:t>Fórmula de Daño:</w:t>
       </w:r>
       <w:r>
-        <w:t xml:space="preserve"> Implementar la función de daño exacta requerida: Damage = (Attack / Defenseop) * BasePower - Speedop * K.</w:t>
+        <w:t xml:space="preserve"> Implementar la función de daño exacta requerida: </w:t>
+      </w:r>
+      <w:proofErr w:type="spellStart"/>
+      <w:r>
+        <w:t>Damage</w:t>
+      </w:r>
+      <w:proofErr w:type="spellEnd"/>
+      <w:r>
+        <w:t xml:space="preserve"> = (</w:t>
+      </w:r>
+      <w:proofErr w:type="spellStart"/>
+      <w:r>
+        <w:t>Attack</w:t>
+      </w:r>
+      <w:proofErr w:type="spellEnd"/>
+      <w:r>
+        <w:t xml:space="preserve"> / </w:t>
+      </w:r>
+      <w:proofErr w:type="spellStart"/>
+      <w:r>
+        <w:t>Defenseop</w:t>
+      </w:r>
+      <w:proofErr w:type="spellEnd"/>
+      <w:r>
+        <w:t xml:space="preserve">) * </w:t>
+      </w:r>
+      <w:proofErr w:type="spellStart"/>
+      <w:r>
+        <w:t>BasePower</w:t>
+      </w:r>
+      <w:proofErr w:type="spellEnd"/>
+      <w:r>
+        <w:t xml:space="preserve"> - </w:t>
+      </w:r>
+      <w:proofErr w:type="spellStart"/>
+      <w:r>
+        <w:t>Speedop</w:t>
+      </w:r>
+      <w:proofErr w:type="spellEnd"/>
+      <w:r>
+        <w:t xml:space="preserve"> * K.</w:t>
       </w:r>
       <w:r>
         <w:t xml:space="preserve"> </w:t>
@@ -219,6 +279,9 @@
     </w:p>
     <w:p>
       <w:r>
+        <w:rPr>
+          <w:noProof/>
+        </w:rPr>
         <w:drawing>
           <wp:inline distT="0" distB="0" distL="0" distR="0" wp14:anchorId="3BB02036" wp14:editId="0D4A0852">
             <wp:extent cx="5400040" cy="3606165"/>
@@ -291,7 +354,23 @@
         <w:t>Mecánicas de Batalla:</w:t>
       </w:r>
       <w:r>
-        <w:t xml:space="preserve"> Implementar el flujo de turnos para combates de 3 vs 3 o 4 vs 4. Asegurar que cada Pokémon tenga 4 movimientos seleccionados al azar , permitir el cambio de Pokémon durante la batalla y </w:t>
+        <w:t xml:space="preserve"> Implementar el flujo de turnos para combates de 3 vs 3 o 4 vs 4. </w:t>
+      </w:r>
+      <w:proofErr w:type="gramStart"/>
+      <w:r>
+        <w:t>Asegurar</w:t>
+      </w:r>
+      <w:proofErr w:type="gramEnd"/>
+      <w:r>
+        <w:t xml:space="preserve"> que cada Pokémon tenga 4 movimientos seleccionados al </w:t>
+      </w:r>
+      <w:proofErr w:type="gramStart"/>
+      <w:r>
+        <w:t>azar ,</w:t>
+      </w:r>
+      <w:proofErr w:type="gramEnd"/>
+      <w:r>
+        <w:t xml:space="preserve"> permitir el cambio de Pokémon durante la batalla y </w:t>
       </w:r>
       <w:r>
         <w:lastRenderedPageBreak/>
@@ -315,6 +394,7 @@
       <w:r>
         <w:t xml:space="preserve"> Implementar la selección de acciones sin ningún criterio para establecer un </w:t>
       </w:r>
+      <w:proofErr w:type="spellStart"/>
       <w:r>
         <w:rPr>
           <w:i/>
@@ -322,6 +402,7 @@
         </w:rPr>
         <w:t>baseline</w:t>
       </w:r>
+      <w:proofErr w:type="spellEnd"/>
       <w:r>
         <w:t>.</w:t>
       </w:r>
@@ -367,6 +448,9 @@
         <w:ind w:left="360"/>
       </w:pPr>
       <w:r>
+        <w:rPr>
+          <w:noProof/>
+        </w:rPr>
         <w:drawing>
           <wp:inline distT="0" distB="0" distL="0" distR="0" wp14:anchorId="09B8A592" wp14:editId="2F71787E">
             <wp:extent cx="5400040" cy="4568825"/>
@@ -439,7 +523,23 @@
         <w:t>Agente Nivel 3 (Heurística Avanzada):</w:t>
       </w:r>
       <w:r>
-        <w:t xml:space="preserve"> Crear una función de evaluación que considere el número de Pokémon vivos , relación de velocidades , ventajas de tipo y estado del combate. Es crucial que todos estos factores estén normalizados.</w:t>
+        <w:t xml:space="preserve"> Crear una función de evaluación que considere el número de Pokémon </w:t>
+      </w:r>
+      <w:proofErr w:type="gramStart"/>
+      <w:r>
+        <w:t>vivos ,</w:t>
+      </w:r>
+      <w:proofErr w:type="gramEnd"/>
+      <w:r>
+        <w:t xml:space="preserve"> relación de </w:t>
+      </w:r>
+      <w:proofErr w:type="gramStart"/>
+      <w:r>
+        <w:t>velocidades ,</w:t>
+      </w:r>
+      <w:proofErr w:type="gramEnd"/>
+      <w:r>
+        <w:t xml:space="preserve"> ventajas de tipo y estado del combate. Es crucial que todos estos factores estén normalizados.</w:t>
       </w:r>
     </w:p>
     <w:p>
@@ -449,16 +549,33 @@
           <w:numId w:val="3"/>
         </w:numPr>
       </w:pPr>
+      <w:proofErr w:type="spellStart"/>
       <w:r>
         <w:rPr>
           <w:b/>
           <w:bCs/>
         </w:rPr>
         <w:lastRenderedPageBreak/>
-        <w:t>Minimax con Poda Alfa-Beta:</w:t>
-      </w:r>
-      <w:r>
-        <w:t xml:space="preserve"> Implementar el algoritmo Minimax con profundidad configurable y poda alfa-beta para que el agente planifique sus movimientos a futuro.</w:t>
+        <w:t>Minimax</w:t>
+      </w:r>
+      <w:proofErr w:type="spellEnd"/>
+      <w:r>
+        <w:rPr>
+          <w:b/>
+          <w:bCs/>
+        </w:rPr>
+        <w:t xml:space="preserve"> con Poda Alfa-Beta:</w:t>
+      </w:r>
+      <w:r>
+        <w:t xml:space="preserve"> Implementar el algoritmo </w:t>
+      </w:r>
+      <w:proofErr w:type="spellStart"/>
+      <w:r>
+        <w:t>Minimax</w:t>
+      </w:r>
+      <w:proofErr w:type="spellEnd"/>
+      <w:r>
+        <w:t xml:space="preserve"> con profundidad configurable y poda alfa-beta para que el agente planifique sus movimientos a futuro.</w:t>
       </w:r>
     </w:p>
     <w:p>
@@ -509,7 +626,55 @@
         <w:t>Interfaz Gráfica (GUI):</w:t>
       </w:r>
       <w:r>
-        <w:t xml:space="preserve"> Usar Pygame o CustomTkinter para crear la visualización del combate. Aquí es donde cargaremos de forma dinámica los sprites y GIFs desde las URLs de Showdown que mencionaste, dándole un aspecto profesional.</w:t>
+        <w:t xml:space="preserve"> Usar </w:t>
+      </w:r>
+      <w:proofErr w:type="spellStart"/>
+      <w:r>
+        <w:t>Pygame</w:t>
+      </w:r>
+      <w:proofErr w:type="spellEnd"/>
+      <w:r>
+        <w:t xml:space="preserve"> o </w:t>
+      </w:r>
+      <w:proofErr w:type="spellStart"/>
+      <w:r>
+        <w:t>CustomTkinter</w:t>
+      </w:r>
+      <w:proofErr w:type="spellEnd"/>
+      <w:r>
+        <w:t xml:space="preserve"> para crear la visualización del combate. Aquí es donde cargaremos de forma dinámica los </w:t>
+      </w:r>
+      <w:proofErr w:type="spellStart"/>
+      <w:r>
+        <w:t>sprites</w:t>
+      </w:r>
+      <w:proofErr w:type="spellEnd"/>
+      <w:r>
+        <w:t xml:space="preserve"> y </w:t>
+      </w:r>
+      <w:proofErr w:type="spellStart"/>
+      <w:r>
+        <w:t>GIFs</w:t>
+      </w:r>
+      <w:proofErr w:type="spellEnd"/>
+      <w:r>
+        <w:t xml:space="preserve"> desde las </w:t>
+      </w:r>
+      <w:proofErr w:type="spellStart"/>
+      <w:r>
+        <w:t>URLs</w:t>
+      </w:r>
+      <w:proofErr w:type="spellEnd"/>
+      <w:r>
+        <w:t xml:space="preserve"> de </w:t>
+      </w:r>
+      <w:proofErr w:type="spellStart"/>
+      <w:r>
+        <w:t>Showdown</w:t>
+      </w:r>
+      <w:proofErr w:type="spellEnd"/>
+      <w:r>
+        <w:t xml:space="preserve"> que mencionaste, dándole un aspecto profesional.</w:t>
       </w:r>
     </w:p>
     <w:p>
@@ -542,7 +707,15 @@
         <w:t>Simulaciones Masivas:</w:t>
       </w:r>
       <w:r>
-        <w:t xml:space="preserve"> Diseñar y ejecutar experimentos enfrentando a los distintos agentes (random vs heurístico vs optimizado).</w:t>
+        <w:t xml:space="preserve"> Diseñar y ejecutar experimentos enfrentando a los distintos agentes (</w:t>
+      </w:r>
+      <w:proofErr w:type="spellStart"/>
+      <w:r>
+        <w:t>random</w:t>
+      </w:r>
+      <w:proofErr w:type="spellEnd"/>
+      <w:r>
+        <w:t xml:space="preserve"> vs heurístico vs optimizado).</w:t>
       </w:r>
     </w:p>
     <w:p>
@@ -560,7 +733,31 @@
         <w:t>Recolección de Métricas:</w:t>
       </w:r>
       <w:r>
-        <w:t xml:space="preserve"> Analizar el impacto de la profundidad de búsqueda y el efecto de la optimización evolutiva , midiendo el win rate y la duración de las partidas.</w:t>
+        <w:t xml:space="preserve"> Analizar el impacto de la profundidad de búsqueda y el efecto de la optimización </w:t>
+      </w:r>
+      <w:proofErr w:type="gramStart"/>
+      <w:r>
+        <w:t>evolutiva ,</w:t>
+      </w:r>
+      <w:proofErr w:type="gramEnd"/>
+      <w:r>
+        <w:t xml:space="preserve"> midiendo el </w:t>
+      </w:r>
+      <w:proofErr w:type="spellStart"/>
+      <w:r>
+        <w:t>win</w:t>
+      </w:r>
+      <w:proofErr w:type="spellEnd"/>
+      <w:r>
+        <w:t xml:space="preserve"> </w:t>
+      </w:r>
+      <w:proofErr w:type="spellStart"/>
+      <w:r>
+        <w:t>rate</w:t>
+      </w:r>
+      <w:proofErr w:type="spellEnd"/>
+      <w:r>
+        <w:t xml:space="preserve"> y la duración de las partidas.</w:t>
       </w:r>
     </w:p>
     <w:p>
@@ -597,11 +794,6 @@
       </w:r>
       <w:r>
         <w:t xml:space="preserve"> Subir todo a un repositorio público de GitHub asegurando que sea reproducible y esté bien documentado.</w:t>
-      </w:r>
-    </w:p>
-    <w:p>
-      <w:r>
-        <w:t>¿Qué te parece este plan de ataque para empezar a codificar la Fase 1?</w:t>
       </w:r>
     </w:p>
     <w:p/>
@@ -1983,6 +2175,7 @@
   <w:style w:type="character" w:default="1" w:styleId="Fuentedeprrafopredeter">
     <w:name w:val="Default Paragraph Font"/>
     <w:uiPriority w:val="1"/>
+    <w:semiHidden/>
     <w:unhideWhenUsed/>
   </w:style>
   <w:style w:type="table" w:default="1" w:styleId="Tablanormal">

</xml_diff>